<commit_message>
Backend update and documentation
</commit_message>
<xml_diff>
--- a/Docs/Documentación/Acta Constitución Proyecto.docx
+++ b/Docs/Documentación/Acta Constitución Proyecto.docx
@@ -1229,21 +1229,7 @@
             <w:rPr>
               <w:color w:val="000000"/>
             </w:rPr>
-            <w:t>Lista de Interesados (</w:t>
-          </w:r>
-          <w:proofErr w:type="spellStart"/>
-          <w:r>
-            <w:rPr>
-              <w:color w:val="000000"/>
-            </w:rPr>
-            <w:t>stakeholders</w:t>
-          </w:r>
-          <w:proofErr w:type="spellEnd"/>
-          <w:r>
-            <w:rPr>
-              <w:color w:val="000000"/>
-            </w:rPr>
-            <w:t>)</w:t>
+            <w:t>Lista de Interesados (stakeholders)</w:t>
           </w:r>
           <w:r>
             <w:rPr>
@@ -2136,21 +2122,12 @@
                 <w:color w:val="000000"/>
               </w:rPr>
             </w:pPr>
-            <w:proofErr w:type="spellStart"/>
-            <w:r>
-              <w:rPr>
-                <w:b/>
-                <w:bCs/>
-              </w:rPr>
-              <w:t>Victor</w:t>
-            </w:r>
-            <w:proofErr w:type="spellEnd"/>
-            <w:r>
-              <w:rPr>
-                <w:b/>
-                <w:bCs/>
-              </w:rPr>
-              <w:t xml:space="preserve"> Garay</w:t>
+            <w:r>
+              <w:rPr>
+                <w:b/>
+                <w:bCs/>
+              </w:rPr>
+              <w:t>Victor Garay</w:t>
             </w:r>
           </w:p>
         </w:tc>
@@ -2449,7 +2426,7 @@
               </w:rPr>
             </w:pPr>
             <w:r>
-              <w:t>Jesús Parra Vega</w:t>
+              <w:t>Eduardo Baeza</w:t>
             </w:r>
           </w:p>
         </w:tc>
@@ -2727,21 +2704,7 @@
               <w:rPr>
                 <w:rFonts w:ascii="Calibri" w:eastAsia="Calibri" w:hAnsi="Calibri" w:cs="Calibri"/>
               </w:rPr>
-              <w:t xml:space="preserve">La aplicación contará con herramientas modernas y actualizadas diferenciándose del resto de </w:t>
-            </w:r>
-            <w:proofErr w:type="gramStart"/>
-            <w:r>
-              <w:rPr>
-                <w:rFonts w:ascii="Calibri" w:eastAsia="Calibri" w:hAnsi="Calibri" w:cs="Calibri"/>
-              </w:rPr>
-              <w:t>apps</w:t>
-            </w:r>
-            <w:proofErr w:type="gramEnd"/>
-            <w:r>
-              <w:rPr>
-                <w:rFonts w:ascii="Calibri" w:eastAsia="Calibri" w:hAnsi="Calibri" w:cs="Calibri"/>
-              </w:rPr>
-              <w:t xml:space="preserve"> tipo bibliotecas que poseen funciones más limitadas, por lo que resolvería </w:t>
+              <w:t xml:space="preserve">La aplicación contará con herramientas modernas y actualizadas diferenciándose del resto de apps tipo bibliotecas que poseen funciones más limitadas, por lo que resolvería </w:t>
             </w:r>
             <w:r>
               <w:rPr>
@@ -2762,21 +2725,7 @@
               <w:rPr>
                 <w:rFonts w:ascii="Calibri" w:eastAsia="Calibri" w:hAnsi="Calibri" w:cs="Calibri"/>
               </w:rPr>
-              <w:t xml:space="preserve">La </w:t>
-            </w:r>
-            <w:proofErr w:type="gramStart"/>
-            <w:r>
-              <w:rPr>
-                <w:rFonts w:ascii="Calibri" w:eastAsia="Calibri" w:hAnsi="Calibri" w:cs="Calibri"/>
-              </w:rPr>
-              <w:t>app</w:t>
-            </w:r>
-            <w:proofErr w:type="gramEnd"/>
-            <w:r>
-              <w:rPr>
-                <w:rFonts w:ascii="Calibri" w:eastAsia="Calibri" w:hAnsi="Calibri" w:cs="Calibri"/>
-              </w:rPr>
-              <w:t xml:space="preserve"> está pensada para ser utilizada por cualquier persona sin importar la edad, por lo que será intuitiva y fácil de utilizar.</w:t>
+              <w:t>La app está pensada para ser utilizada por cualquier persona sin importar la edad, por lo que será intuitiva y fácil de utilizar.</w:t>
             </w:r>
           </w:p>
           <w:p>
@@ -4877,29 +4826,7 @@
           <w:sz w:val="32"/>
           <w:szCs w:val="32"/>
         </w:rPr>
-        <w:t>Lista de Interesados (</w:t>
-      </w:r>
-      <w:proofErr w:type="spellStart"/>
-      <w:r>
-        <w:rPr>
-          <w:b/>
-          <w:bCs/>
-          <w:color w:val="365F91"/>
-          <w:sz w:val="32"/>
-          <w:szCs w:val="32"/>
-        </w:rPr>
-        <w:t>stakeholders</w:t>
-      </w:r>
-      <w:proofErr w:type="spellEnd"/>
-      <w:r>
-        <w:rPr>
-          <w:b/>
-          <w:bCs/>
-          <w:color w:val="365F91"/>
-          <w:sz w:val="32"/>
-          <w:szCs w:val="32"/>
-        </w:rPr>
-        <w:t>)</w:t>
+        <w:t>Lista de Interesados (stakeholders)</w:t>
       </w:r>
     </w:p>
     <w:tbl>
@@ -5826,21 +5753,7 @@
               <w:rPr>
                 <w:color w:val="000000"/>
               </w:rPr>
-              <w:t>Decisiones de personal (</w:t>
-            </w:r>
-            <w:proofErr w:type="spellStart"/>
-            <w:r>
-              <w:rPr>
-                <w:color w:val="000000"/>
-              </w:rPr>
-              <w:t>Staffing</w:t>
-            </w:r>
-            <w:proofErr w:type="spellEnd"/>
-            <w:r>
-              <w:rPr>
-                <w:color w:val="000000"/>
-              </w:rPr>
-              <w:t>)</w:t>
+              <w:t>Decisiones de personal (Staffing)</w:t>
             </w:r>
           </w:p>
         </w:tc>

</xml_diff>